<commit_message>
Finished chap 6, continued chap 4, edited airbag sizing code
</commit_message>
<xml_diff>
--- a/PH0__Allowables_and_Failure_Scenarios/Mission_and_Impact_Analysis/WP2_Appunti_Codice_IMPATTO-PAYLOAD.docx
+++ b/PH0__Allowables_and_Failure_Scenarios/Mission_and_Impact_Analysis/WP2_Appunti_Codice_IMPATTO-PAYLOAD.docx
@@ -565,13 +565,8 @@
           <w:numId w:val="1"/>
         </w:numPr>
       </w:pPr>
-      <w:proofErr w:type="spellStart"/>
-      <w:r>
-        <w:t>Grid</w:t>
-      </w:r>
-      <w:proofErr w:type="spellEnd"/>
-      <w:r>
-        <w:t>: 500x500 (</w:t>
+      <w:r>
+        <w:t>Grid: 500x500 (</w:t>
       </w:r>
       <w:proofErr w:type="spellStart"/>
       <w:r>
@@ -648,7 +643,7 @@
         <w:rPr>
           <w:lang w:val="en-GB"/>
         </w:rPr>
-        <w:t>0.0001°</w:t>
+        <w:tab/>
       </w:r>
     </w:p>
     <w:p>
@@ -2214,6 +2209,7 @@
       </w:pPr>
       <w:r>
         <w:rPr>
+          <w:noProof/>
           <w:lang w:val="en-GB"/>
         </w:rPr>
         <w:drawing>
@@ -2261,6 +2257,7 @@
       </w:pPr>
       <w:r>
         <w:rPr>
+          <w:noProof/>
           <w:lang w:val="en-GB"/>
         </w:rPr>
         <w:lastRenderedPageBreak/>

</xml_diff>